<commit_message>
Document Splat Fighters input strategy
</commit_message>
<xml_diff>
--- a/Splat Fighters/Docs/Splat_Fighters_Project_Technical_Documentation.docx
+++ b/Splat Fighters/Docs/Splat_Fighters_Project_Technical_Documentation.docx
@@ -50,7 +50,7 @@
         <w:br/>
       </w:r>
       <w:r>
-        <w:t>Input: New Input System</w:t>
+        <w:t>Input: Legacy Unity Input Manager for MVP</w:t>
         <w:br/>
       </w:r>
       <w:r>
@@ -1439,7 +1439,7 @@
           </w:tcPr>
           <w:p>
             <w:r>
-              <w:t>PlayerInputReader.cs</w:t>
+              <w:t>PlayerInputHandler.cs</w:t>
             </w:r>
           </w:p>
         </w:tc>
@@ -1472,7 +1472,7 @@
           </w:tcPr>
           <w:p>
             <w:r>
-              <w:t>Reads New Input System actions and exposes input state.</w:t>
+              <w:t>Reads legacy axes and KeyCode actions and exposes MVP input state.</w:t>
             </w:r>
           </w:p>
         </w:tc>

</xml_diff>